<commit_message>
update readme, add code files
</commit_message>
<xml_diff>
--- a/Notes/VariogramAnalysis.docx
+++ b/Notes/VariogramAnalysis.docx
@@ -39,43 +39,213 @@
     </w:p>
     <w:p>
       <w:r>
-        <w:t xml:space="preserve">Model        Nugget     Sill       Range      RMSE       WRSS      </w:t>
-      </w:r>
-    </w:p>
-    <w:p>
-      <w:r>
-        <w:t>-----------------------------------------------------------------</w:t>
-      </w:r>
-    </w:p>
-    <w:p>
-      <w:r>
-        <w:t xml:space="preserve">Gaussian     0.3943     0.5850     0.2223     0.3510     6.9115    </w:t>
-      </w:r>
-    </w:p>
-    <w:p>
-      <w:r>
-        <w:t xml:space="preserve">Spherical    0.3231     0.6407     0.4740     0.3543     7.7140    </w:t>
+        <w:t>GAMV parameters: lag distance = 0.078, lag tolerance = 0.05, n90</w:t>
       </w:r>
     </w:p>
     <w:p>
       <w:pPr>
+        <w:pBdr>
+          <w:bottom w:val="single" w:sz="6" w:space="1" w:color="auto"/>
+        </w:pBdr>
+      </w:pPr>
+      <w:r>
+        <w:t xml:space="preserve">Model        </w:t>
+      </w:r>
+      <w:r>
+        <w:t xml:space="preserve">         </w:t>
+      </w:r>
+      <w:r>
+        <w:t xml:space="preserve">Nugget     </w:t>
+      </w:r>
+      <w:r>
+        <w:t xml:space="preserve">     </w:t>
+      </w:r>
+      <w:r>
+        <w:t>p</w:t>
+      </w:r>
+      <w:r>
+        <w:t xml:space="preserve">Sill       </w:t>
+      </w:r>
+      <w:r>
+        <w:t xml:space="preserve">    </w:t>
+      </w:r>
+      <w:r>
+        <w:t xml:space="preserve">Range      </w:t>
+      </w:r>
+      <w:r>
+        <w:t xml:space="preserve">    </w:t>
+      </w:r>
+      <w:r>
+        <w:t xml:space="preserve">RMSE       </w:t>
+      </w:r>
+      <w:r>
+        <w:t xml:space="preserve"> </w:t>
+      </w:r>
+      <w:r>
+        <w:t xml:space="preserve">WRSS      </w:t>
+      </w:r>
+    </w:p>
+    <w:p>
+      <w:r>
+        <w:t xml:space="preserve">Gaussian     </w:t>
+      </w:r>
+      <w:r>
+        <w:t xml:space="preserve">       </w:t>
+      </w:r>
+      <w:r>
+        <w:t xml:space="preserve">0.3943     </w:t>
+      </w:r>
+      <w:r>
+        <w:t xml:space="preserve">   </w:t>
+      </w:r>
+      <w:r>
+        <w:t xml:space="preserve">0.5850     </w:t>
+      </w:r>
+      <w:r>
+        <w:t xml:space="preserve">  </w:t>
+      </w:r>
+      <w:r>
+        <w:t xml:space="preserve">0.2223     </w:t>
+      </w:r>
+      <w:r>
+        <w:t xml:space="preserve">  </w:t>
+      </w:r>
+      <w:r>
+        <w:t xml:space="preserve">0.3510     </w:t>
+      </w:r>
+      <w:r>
+        <w:t xml:space="preserve">   </w:t>
+      </w:r>
+      <w:r>
+        <w:t xml:space="preserve">6.9115    </w:t>
+      </w:r>
+    </w:p>
+    <w:p>
+      <w:r>
+        <w:t xml:space="preserve">Spherical    </w:t>
+      </w:r>
+      <w:r>
+        <w:t xml:space="preserve">        </w:t>
+      </w:r>
+      <w:r>
+        <w:t xml:space="preserve">0.3231     </w:t>
+      </w:r>
+      <w:r>
+        <w:t xml:space="preserve">   </w:t>
+      </w:r>
+      <w:r>
+        <w:t xml:space="preserve">0.6407     </w:t>
+      </w:r>
+      <w:r>
+        <w:t xml:space="preserve"> </w:t>
+      </w:r>
+      <w:r>
+        <w:t xml:space="preserve">0.4740     </w:t>
+      </w:r>
+      <w:r>
+        <w:t xml:space="preserve">  </w:t>
+      </w:r>
+      <w:r>
+        <w:t xml:space="preserve">0.3543     </w:t>
+      </w:r>
+      <w:r>
+        <w:t xml:space="preserve">    </w:t>
+      </w:r>
+      <w:r>
+        <w:t xml:space="preserve">7.7140    </w:t>
+      </w:r>
+    </w:p>
+    <w:p>
+      <w:pPr>
         <w:rPr>
           <w:color w:val="787800"/>
         </w:rPr>
       </w:pPr>
-      <w:proofErr w:type="gramStart"/>
       <w:r>
         <w:rPr>
           <w:color w:val="787800"/>
         </w:rPr>
-        <w:t>Exponential  0.3073</w:t>
-      </w:r>
-      <w:proofErr w:type="gramEnd"/>
+        <w:t xml:space="preserve">Exponential  </w:t>
+      </w:r>
       <w:r>
         <w:rPr>
           <w:color w:val="787800"/>
         </w:rPr>
-        <w:t xml:space="preserve">     0.7354     0.2820     0.3429     8.4383</w:t>
+        <w:t xml:space="preserve">     </w:t>
+      </w:r>
+      <w:r>
+        <w:rPr>
+          <w:color w:val="787800"/>
+        </w:rPr>
+        <w:t xml:space="preserve">0.3073     </w:t>
+      </w:r>
+      <w:r>
+        <w:rPr>
+          <w:color w:val="787800"/>
+        </w:rPr>
+        <w:t xml:space="preserve">   </w:t>
+      </w:r>
+      <w:r>
+        <w:rPr>
+          <w:color w:val="787800"/>
+        </w:rPr>
+        <w:t xml:space="preserve">0.7354     </w:t>
+      </w:r>
+      <w:r>
+        <w:rPr>
+          <w:color w:val="787800"/>
+        </w:rPr>
+        <w:t xml:space="preserve"> </w:t>
+      </w:r>
+      <w:r>
+        <w:rPr>
+          <w:color w:val="787800"/>
+        </w:rPr>
+        <w:t xml:space="preserve">0.2820     </w:t>
+      </w:r>
+      <w:r>
+        <w:rPr>
+          <w:color w:val="787800"/>
+        </w:rPr>
+        <w:t xml:space="preserve">  </w:t>
+      </w:r>
+      <w:r>
+        <w:rPr>
+          <w:color w:val="787800"/>
+        </w:rPr>
+        <w:t xml:space="preserve">0.3429     </w:t>
+      </w:r>
+      <w:r>
+        <w:rPr>
+          <w:color w:val="787800"/>
+        </w:rPr>
+        <w:t xml:space="preserve">    </w:t>
+      </w:r>
+      <w:r>
+        <w:rPr>
+          <w:color w:val="787800"/>
+        </w:rPr>
+        <w:t>8.4383</w:t>
+      </w:r>
+    </w:p>
+    <w:p>
+      <w:pPr>
+        <w:rPr>
+          <w:color w:val="787800"/>
+        </w:rPr>
+      </w:pPr>
+    </w:p>
+    <w:p>
+      <w:pPr>
+        <w:rPr>
+          <w:color w:val="787800"/>
+        </w:rPr>
+      </w:pPr>
+      <w:r>
+        <w:rPr>
+          <w:color w:val="787800"/>
+        </w:rPr>
+        <w:t xml:space="preserve">GAMV parameters: </w:t>
       </w:r>
     </w:p>
     <w:p/>
@@ -693,6 +863,7 @@
   <w:style w:type="character" w:default="1" w:styleId="DefaultParagraphFont">
     <w:name w:val="Default Paragraph Font"/>
     <w:uiPriority w:val="1"/>
+    <w:semiHidden/>
     <w:unhideWhenUsed/>
   </w:style>
   <w:style w:type="table" w:default="1" w:styleId="TableNormal">

</xml_diff>